<commit_message>
Deploy preview for PR 653 🛫
</commit_message>
<xml_diff>
--- a/pr-preview/pr-653/vignettes/articles/version-crosswalk-1.3-to-1.4.docx
+++ b/pr-preview/pr-653/vignettes/articles/version-crosswalk-1.3-to-1.4.docx
@@ -3049,7 +3049,7 @@
         <w:rPr>
           <w:rStyle w:val="CommentTok"/>
         </w:rPr>
-        <w:t xml:space="preserve">#&gt;     age id    antigen_iso value</w:t>
+        <w:t xml:space="preserve">#&gt;     age id    antigen_iso  value</w:t>
       </w:r>
       <w:r>
         <w:br/>
@@ -3058,7 +3058,7 @@
         <w:rPr>
           <w:rStyle w:val="CommentTok"/>
         </w:rPr>
-        <w:t xml:space="preserve">#&gt;   &lt;dbl&gt; &lt;chr&gt; &lt;chr&gt;       &lt;dbl&gt;</w:t>
+        <w:t xml:space="preserve">#&gt;   &lt;dbl&gt; &lt;chr&gt; &lt;chr&gt;        &lt;dbl&gt;</w:t>
       </w:r>
       <w:r>
         <w:br/>
@@ -3067,7 +3067,7 @@
         <w:rPr>
           <w:rStyle w:val="CommentTok"/>
         </w:rPr>
-        <w:t xml:space="preserve">#&gt; 1  2.23 1     HlyE_IgA    0.161</w:t>
+        <w:t xml:space="preserve">#&gt; 1 13.0  1     HlyE_IgA     4.52 </w:t>
       </w:r>
       <w:r>
         <w:br/>
@@ -3076,7 +3076,7 @@
         <w:rPr>
           <w:rStyle w:val="CommentTok"/>
         </w:rPr>
-        <w:t xml:space="preserve">#&gt; 2  2.23 1     HlyE_IgG    0.628</w:t>
+        <w:t xml:space="preserve">#&gt; 2 13.0  1     HlyE_IgG     2.07 </w:t>
       </w:r>
       <w:r>
         <w:br/>
@@ -3085,7 +3085,7 @@
         <w:rPr>
           <w:rStyle w:val="CommentTok"/>
         </w:rPr>
-        <w:t xml:space="preserve">#&gt; 3  0.19 2     HlyE_IgA    0.740</w:t>
+        <w:t xml:space="preserve">#&gt; 3 15.8  2     HlyE_IgA     0.507</w:t>
       </w:r>
       <w:r>
         <w:br/>
@@ -3094,7 +3094,7 @@
         <w:rPr>
           <w:rStyle w:val="CommentTok"/>
         </w:rPr>
-        <w:t xml:space="preserve">#&gt; 4  0.19 2     HlyE_IgG    0.763</w:t>
+        <w:t xml:space="preserve">#&gt; 4 15.8  2     HlyE_IgG     1.07 </w:t>
       </w:r>
       <w:r>
         <w:br/>
@@ -3103,7 +3103,7 @@
         <w:rPr>
           <w:rStyle w:val="CommentTok"/>
         </w:rPr>
-        <w:t xml:space="preserve">#&gt; 5 12.5  3     HlyE_IgA    1.50 </w:t>
+        <w:t xml:space="preserve">#&gt; 5  4.43 3     HlyE_IgA     4.34 </w:t>
       </w:r>
       <w:r>
         <w:br/>
@@ -3112,7 +3112,7 @@
         <w:rPr>
           <w:rStyle w:val="CommentTok"/>
         </w:rPr>
-        <w:t xml:space="preserve">#&gt; 6 12.5  3     HlyE_IgG    0.837</w:t>
+        <w:t xml:space="preserve">#&gt; 6  4.43 3     HlyE_IgG    13.0</w:t>
       </w:r>
       <w:r>
         <w:br/>

</xml_diff>